<commit_message>
feat: help search engines connect the base to how people search for it
People look for this place as «база отдыха Рыбачий» and «турбаза Рыбачий»,
neither of which matched the site's own wording. The organisation markup now
carries those as alternate names and lists the areas served, which ties the
synonyms to one business without stuffing them into the copy.
</commit_message>
<xml_diff>
--- a/handoff/КП-новый-сайт.docx
+++ b/handoff/КП-новый-сайт.docx
@@ -250,12 +250,6 @@
         <w:gridCol w:w="9026"/>
       </w:tblGrid>
       <w:tr>
-        <w:tblPrEx>
-          <w:tblCellMar>
-            <w:top w:w="0" w:type="dxa"/>
-            <w:bottom w:w="0" w:type="dxa"/>
-          </w:tblCellMar>
-        </w:tblPrEx>
         <w:trPr>
           <w:trHeight w:val="2600"/>
         </w:trPr>
@@ -317,136 +311,6 @@
     </w:tbl>
     <w:p>
       <w:r>
-        <w:br w:type="page"/>
-      </w:r>
-    </w:p>
-    <w:p>
-      <w:pPr>
-        <w:pStyle w:val="1"/>
-        <w:spacing w:before="240" w:after="200"/>
-        <w:rPr>
-          <w:lang w:val="ru-RU"/>
-        </w:rPr>
-      </w:pPr>
-      <w:r>
-        <w:rPr>
-          <w:rFonts w:ascii="Calibri" w:eastAsia="Calibri" w:hAnsi="Calibri" w:cs="Calibri"/>
-          <w:b/>
-          <w:bCs/>
-          <w:color w:val="0E2430"/>
-          <w:sz w:val="34"/>
-          <w:szCs w:val="34"/>
-          <w:lang w:val="ru-RU"/>
-        </w:rPr>
-        <w:lastRenderedPageBreak/>
-        <w:t>Три вещи, которые сегодня стоят вам денег</w:t>
-      </w:r>
-    </w:p>
-    <w:p>
-      <w:pPr>
-        <w:pStyle w:val="a4"/>
-        <w:numPr>
-          <w:ilvl w:val="0"/>
-          <w:numId w:val="2"/>
-        </w:numPr>
-        <w:spacing w:after="90" w:line="290" w:lineRule="auto"/>
-        <w:rPr>
-          <w:lang w:val="ru-RU"/>
-        </w:rPr>
-      </w:pPr>
-      <w:r>
-        <w:rPr>
-          <w:rFonts w:ascii="Calibri" w:eastAsia="Calibri" w:hAnsi="Calibri" w:cs="Calibri"/>
-          <w:color w:val="20303A"/>
-          <w:sz w:val="22"/>
-          <w:szCs w:val="22"/>
-          <w:lang w:val="ru-RU"/>
-        </w:rPr>
-        <w:t>Гость не видит свободных дат и пишет «а свободно ли 12-е». Половина не пишет вовсе — уходит к тем, у кого календарь на сайте.</w:t>
-      </w:r>
-    </w:p>
-    <w:p>
-      <w:pPr>
-        <w:pStyle w:val="a4"/>
-        <w:numPr>
-          <w:ilvl w:val="0"/>
-          <w:numId w:val="2"/>
-        </w:numPr>
-        <w:spacing w:after="90" w:line="290" w:lineRule="auto"/>
-        <w:rPr>
-          <w:lang w:val="ru-RU"/>
-        </w:rPr>
-      </w:pPr>
-      <w:r>
-        <w:rPr>
-          <w:rFonts w:ascii="Calibri" w:eastAsia="Calibri" w:hAnsi="Calibri" w:cs="Calibri"/>
-          <w:color w:val="20303A"/>
-          <w:sz w:val="22"/>
-          <w:szCs w:val="22"/>
-          <w:lang w:val="ru-RU"/>
-        </w:rPr>
-        <w:t>Чтобы поменять цену или добавить фото, нужен я. Значит, цены на сайте всегда немного не те.</w:t>
-      </w:r>
-    </w:p>
-    <w:p>
-      <w:pPr>
-        <w:pStyle w:val="a4"/>
-        <w:numPr>
-          <w:ilvl w:val="0"/>
-          <w:numId w:val="2"/>
-        </w:numPr>
-        <w:spacing w:after="90" w:line="290" w:lineRule="auto"/>
-        <w:rPr>
-          <w:lang w:val="ru-RU"/>
-        </w:rPr>
-      </w:pPr>
-      <w:r>
-        <w:rPr>
-          <w:rFonts w:ascii="Calibri" w:eastAsia="Calibri" w:hAnsi="Calibri" w:cs="Calibri"/>
-          <w:color w:val="20303A"/>
-          <w:sz w:val="22"/>
-          <w:szCs w:val="22"/>
-          <w:lang w:val="ru-RU"/>
-        </w:rPr>
-        <w:t>Заявки живут в переписке. Что-то теряется, что-то вспоминается через два дня.</w:t>
-      </w:r>
-    </w:p>
-    <w:p>
-      <w:pPr>
-        <w:pBdr>
-          <w:bottom w:val="single" w:sz="6" w:space="0" w:color="D6E0DA"/>
-        </w:pBdr>
-        <w:spacing w:before="120" w:after="200"/>
-        <w:rPr>
-          <w:lang w:val="ru-RU"/>
-        </w:rPr>
-      </w:pPr>
-    </w:p>
-    <w:p>
-      <w:pPr>
-        <w:spacing w:after="140" w:line="300" w:lineRule="auto"/>
-        <w:rPr>
-          <w:lang w:val="ru-RU"/>
-        </w:rPr>
-      </w:pPr>
-      <w:r>
-        <w:rPr>
-          <w:rFonts w:ascii="Calibri" w:eastAsia="Calibri" w:hAnsi="Calibri" w:cs="Calibri"/>
-          <w:color w:val="20303A"/>
-          <w:sz w:val="22"/>
-          <w:szCs w:val="22"/>
-          <w:lang w:val="ru-RU"/>
-        </w:rPr>
-        <w:t>Новый сайт закрывает все три. Как именно — на следующих страницах</w:t>
-      </w:r>
-    </w:p>
-    <w:p>
-      <w:pPr>
-        <w:rPr>
-          <w:lang w:val="ru-RU"/>
-        </w:rPr>
-      </w:pPr>
-      <w:r>
         <w:rPr>
           <w:lang w:val="ru-RU"/>
         </w:rPr>
@@ -604,12 +468,6 @@
         <w:gridCol w:w="9026"/>
       </w:tblGrid>
       <w:tr>
-        <w:tblPrEx>
-          <w:tblCellMar>
-            <w:top w:w="0" w:type="dxa"/>
-            <w:bottom w:w="0" w:type="dxa"/>
-          </w:tblCellMar>
-        </w:tblPrEx>
         <w:tc>
           <w:tcPr>
             <w:tcW w:w="9026" w:type="dxa"/>
@@ -637,7 +495,7 @@
                 <w:szCs w:val="21"/>
                 <w:lang w:val="ru-RU"/>
               </w:rPr>
-              <w:t xml:space="preserve">Что это даёт: </w:t>
+              <w:t>Что это даёт:</w:t>
             </w:r>
             <w:r>
               <w:rPr>
@@ -647,7 +505,27 @@
                 <w:szCs w:val="21"/>
                 <w:lang w:val="ru-RU"/>
               </w:rPr>
-              <w:t xml:space="preserve">Заявку видит не только тот, кто сидит в одном мессенджере. Люди, которые никогда не напишут в </w:t>
+              <w:t xml:space="preserve"> </w:t>
+            </w:r>
+            <w:r>
+              <w:rPr>
+                <w:rFonts w:ascii="Calibri" w:eastAsia="Calibri" w:hAnsi="Calibri" w:cs="Calibri"/>
+                <w:color w:val="20303A"/>
+                <w:sz w:val="21"/>
+                <w:szCs w:val="21"/>
+                <w:lang w:val="ru-RU"/>
+              </w:rPr>
+              <w:t>Люди</w:t>
+            </w:r>
+            <w:r>
+              <w:rPr>
+                <w:rFonts w:ascii="Calibri" w:eastAsia="Calibri" w:hAnsi="Calibri" w:cs="Calibri"/>
+                <w:color w:val="20303A"/>
+                <w:sz w:val="21"/>
+                <w:szCs w:val="21"/>
+                <w:lang w:val="ru-RU"/>
+              </w:rPr>
+              <w:t xml:space="preserve">, которые никогда не напишут в </w:t>
             </w:r>
             <w:r>
               <w:rPr>
@@ -741,12 +619,6 @@
         <w:gridCol w:w="9026"/>
       </w:tblGrid>
       <w:tr>
-        <w:tblPrEx>
-          <w:tblCellMar>
-            <w:top w:w="0" w:type="dxa"/>
-            <w:bottom w:w="0" w:type="dxa"/>
-          </w:tblCellMar>
-        </w:tblPrEx>
         <w:trPr>
           <w:trHeight w:val="2600"/>
         </w:trPr>
@@ -841,7 +713,7 @@
           <w:szCs w:val="26"/>
           <w:lang w:val="ru-RU"/>
         </w:rPr>
-        <w:t>Гость сам видит, когда свободно — и выбирает даты кликом</w:t>
+        <w:t>Гость сам видит, когда свободно и выбирает даты кликом</w:t>
       </w:r>
     </w:p>
     <w:p>
@@ -1050,12 +922,6 @@
         <w:gridCol w:w="9026"/>
       </w:tblGrid>
       <w:tr>
-        <w:tblPrEx>
-          <w:tblCellMar>
-            <w:top w:w="0" w:type="dxa"/>
-            <w:bottom w:w="0" w:type="dxa"/>
-          </w:tblCellMar>
-        </w:tblPrEx>
         <w:tc>
           <w:tcPr>
             <w:tcW w:w="9026" w:type="dxa"/>
@@ -1083,7 +949,20 @@
                 <w:szCs w:val="21"/>
                 <w:lang w:val="ru-RU"/>
               </w:rPr>
-              <w:t xml:space="preserve">Что это даёт: </w:t>
+              <w:t>Что это даёт</w:t>
+            </w:r>
+            <w:proofErr w:type="gramStart"/>
+            <w:r>
+              <w:rPr>
+                <w:rFonts w:ascii="Calibri" w:eastAsia="Calibri" w:hAnsi="Calibri" w:cs="Calibri"/>
+                <w:b/>
+                <w:bCs/>
+                <w:color w:val="0E2430"/>
+                <w:sz w:val="21"/>
+                <w:szCs w:val="21"/>
+                <w:lang w:val="ru-RU"/>
+              </w:rPr>
+              <w:t xml:space="preserve">: </w:t>
             </w:r>
             <w:r>
               <w:rPr>
@@ -1093,7 +972,18 @@
                 <w:szCs w:val="21"/>
                 <w:lang w:val="ru-RU"/>
               </w:rPr>
-              <w:t>Пропадает половина звонков «а есть места?». К вам приходят заявки с датами.</w:t>
+              <w:t>Пропадает</w:t>
+            </w:r>
+            <w:proofErr w:type="gramEnd"/>
+            <w:r>
+              <w:rPr>
+                <w:rFonts w:ascii="Calibri" w:eastAsia="Calibri" w:hAnsi="Calibri" w:cs="Calibri"/>
+                <w:color w:val="20303A"/>
+                <w:sz w:val="21"/>
+                <w:szCs w:val="21"/>
+                <w:lang w:val="ru-RU"/>
+              </w:rPr>
+              <w:t xml:space="preserve"> половина звонков «а есть места?». К вам приходят заявки с датами.</w:t>
             </w:r>
           </w:p>
         </w:tc>
@@ -1128,12 +1018,6 @@
         <w:gridCol w:w="9026"/>
       </w:tblGrid>
       <w:tr>
-        <w:tblPrEx>
-          <w:tblCellMar>
-            <w:top w:w="0" w:type="dxa"/>
-            <w:bottom w:w="0" w:type="dxa"/>
-          </w:tblCellMar>
-        </w:tblPrEx>
         <w:trPr>
           <w:trHeight w:val="2600"/>
         </w:trPr>
@@ -1243,7 +1127,27 @@
           <w:szCs w:val="22"/>
           <w:lang w:val="ru-RU"/>
         </w:rPr>
-        <w:t xml:space="preserve">Цены, тексты, фотографии, домики, туры, вопросы и ответы — и даже целые новые страницы. Страница собирается из готовых блоков, как из кубиков: обложка, текст с фото, галерея, цены, карта. </w:t>
+        <w:t>Цены, тексты, фотографии, домики, туры, вопросы и ответы</w:t>
+      </w:r>
+      <w:r>
+        <w:rPr>
+          <w:rFonts w:ascii="Calibri" w:eastAsia="Calibri" w:hAnsi="Calibri" w:cs="Calibri"/>
+          <w:color w:val="20303A"/>
+          <w:sz w:val="22"/>
+          <w:szCs w:val="22"/>
+          <w:lang w:val="ru-RU"/>
+        </w:rPr>
+        <w:t>,</w:t>
+      </w:r>
+      <w:r>
+        <w:rPr>
+          <w:rFonts w:ascii="Calibri" w:eastAsia="Calibri" w:hAnsi="Calibri" w:cs="Calibri"/>
+          <w:color w:val="20303A"/>
+          <w:sz w:val="22"/>
+          <w:szCs w:val="22"/>
+          <w:lang w:val="ru-RU"/>
+        </w:rPr>
+        <w:t xml:space="preserve"> и даже целые новые страницы. Страница собирается из готовых блоков, как из кубиков: обложка, текст с фото, галерея, цены, карта. </w:t>
       </w:r>
       <w:proofErr w:type="spellStart"/>
       <w:r>
@@ -1427,12 +1331,6 @@
         <w:gridCol w:w="9026"/>
       </w:tblGrid>
       <w:tr>
-        <w:tblPrEx>
-          <w:tblCellMar>
-            <w:top w:w="0" w:type="dxa"/>
-            <w:bottom w:w="0" w:type="dxa"/>
-          </w:tblCellMar>
-        </w:tblPrEx>
         <w:tc>
           <w:tcPr>
             <w:tcW w:w="9026" w:type="dxa"/>
@@ -1470,7 +1368,7 @@
                 <w:szCs w:val="21"/>
                 <w:lang w:val="ru-RU"/>
               </w:rPr>
-              <w:t xml:space="preserve">Вы больше не ждёте, чтобы поднять цену на баню. </w:t>
+              <w:t>Вы больше не ждёте</w:t>
             </w:r>
             <w:r>
               <w:rPr>
@@ -1480,7 +1378,7 @@
                 <w:szCs w:val="21"/>
                 <w:lang w:val="ru-RU"/>
               </w:rPr>
-              <w:t>И не платите за каждую правку.</w:t>
+              <w:t xml:space="preserve"> изменений, а меняете все что вам нужно здесь и сейчас.</w:t>
             </w:r>
           </w:p>
         </w:tc>
@@ -1515,12 +1413,6 @@
         <w:gridCol w:w="9026"/>
       </w:tblGrid>
       <w:tr>
-        <w:tblPrEx>
-          <w:tblCellMar>
-            <w:top w:w="0" w:type="dxa"/>
-            <w:bottom w:w="0" w:type="dxa"/>
-          </w:tblCellMar>
-        </w:tblPrEx>
         <w:trPr>
           <w:trHeight w:val="2600"/>
         </w:trPr>
@@ -1583,6 +1475,9 @@
     <w:p>
       <w:pPr>
         <w:spacing w:before="280" w:after="80"/>
+        <w:rPr>
+          <w:lang w:val="ru-RU"/>
+        </w:rPr>
       </w:pPr>
       <w:r>
         <w:rPr>
@@ -1592,11 +1487,11 @@
           <w:color w:val="2F7A5E"/>
           <w:sz w:val="26"/>
           <w:szCs w:val="26"/>
+          <w:lang w:val="ru-RU"/>
         </w:rPr>
         <w:lastRenderedPageBreak/>
         <w:t xml:space="preserve">4. </w:t>
       </w:r>
-      <w:proofErr w:type="spellStart"/>
       <w:r>
         <w:rPr>
           <w:rFonts w:ascii="Calibri" w:eastAsia="Calibri" w:hAnsi="Calibri" w:cs="Calibri"/>
@@ -1605,92 +1500,9 @@
           <w:color w:val="0E2430"/>
           <w:sz w:val="26"/>
           <w:szCs w:val="26"/>
-        </w:rPr>
-        <w:t>Кнопка</w:t>
-      </w:r>
-      <w:proofErr w:type="spellEnd"/>
-      <w:r>
-        <w:rPr>
-          <w:rFonts w:ascii="Calibri" w:eastAsia="Calibri" w:hAnsi="Calibri" w:cs="Calibri"/>
-          <w:b/>
-          <w:bCs/>
-          <w:color w:val="0E2430"/>
-          <w:sz w:val="26"/>
-          <w:szCs w:val="26"/>
-        </w:rPr>
-        <w:t xml:space="preserve"> «</w:t>
-      </w:r>
-      <w:proofErr w:type="spellStart"/>
-      <w:r>
-        <w:rPr>
-          <w:rFonts w:ascii="Calibri" w:eastAsia="Calibri" w:hAnsi="Calibri" w:cs="Calibri"/>
-          <w:b/>
-          <w:bCs/>
-          <w:color w:val="0E2430"/>
-          <w:sz w:val="26"/>
-          <w:szCs w:val="26"/>
-        </w:rPr>
-        <w:t>вернуть</w:t>
-      </w:r>
-      <w:proofErr w:type="spellEnd"/>
-      <w:r>
-        <w:rPr>
-          <w:rFonts w:ascii="Calibri" w:eastAsia="Calibri" w:hAnsi="Calibri" w:cs="Calibri"/>
-          <w:b/>
-          <w:bCs/>
-          <w:color w:val="0E2430"/>
-          <w:sz w:val="26"/>
-          <w:szCs w:val="26"/>
-        </w:rPr>
-        <w:t xml:space="preserve"> </w:t>
-      </w:r>
-      <w:proofErr w:type="spellStart"/>
-      <w:r>
-        <w:rPr>
-          <w:rFonts w:ascii="Calibri" w:eastAsia="Calibri" w:hAnsi="Calibri" w:cs="Calibri"/>
-          <w:b/>
-          <w:bCs/>
-          <w:color w:val="0E2430"/>
-          <w:sz w:val="26"/>
-          <w:szCs w:val="26"/>
-        </w:rPr>
-        <w:t>как</w:t>
-      </w:r>
-      <w:proofErr w:type="spellEnd"/>
-      <w:r>
-        <w:rPr>
-          <w:rFonts w:ascii="Calibri" w:eastAsia="Calibri" w:hAnsi="Calibri" w:cs="Calibri"/>
-          <w:b/>
-          <w:bCs/>
-          <w:color w:val="0E2430"/>
-          <w:sz w:val="26"/>
-          <w:szCs w:val="26"/>
-        </w:rPr>
-        <w:t xml:space="preserve"> </w:t>
-      </w:r>
-      <w:proofErr w:type="spellStart"/>
-      <w:r>
-        <w:rPr>
-          <w:rFonts w:ascii="Calibri" w:eastAsia="Calibri" w:hAnsi="Calibri" w:cs="Calibri"/>
-          <w:b/>
-          <w:bCs/>
-          <w:color w:val="0E2430"/>
-          <w:sz w:val="26"/>
-          <w:szCs w:val="26"/>
-        </w:rPr>
-        <w:t>было</w:t>
-      </w:r>
-      <w:proofErr w:type="spellEnd"/>
-      <w:r>
-        <w:rPr>
-          <w:rFonts w:ascii="Calibri" w:eastAsia="Calibri" w:hAnsi="Calibri" w:cs="Calibri"/>
-          <w:b/>
-          <w:bCs/>
-          <w:color w:val="0E2430"/>
-          <w:sz w:val="26"/>
-          <w:szCs w:val="26"/>
-        </w:rPr>
-        <w:t>»</w:t>
+          <w:lang w:val="ru-RU"/>
+        </w:rPr>
+        <w:t>Кнопка «вернуть как было»</w:t>
       </w:r>
     </w:p>
     <w:p>
@@ -1732,12 +1544,6 @@
         <w:gridCol w:w="9026"/>
       </w:tblGrid>
       <w:tr>
-        <w:tblPrEx>
-          <w:tblCellMar>
-            <w:top w:w="0" w:type="dxa"/>
-            <w:bottom w:w="0" w:type="dxa"/>
-          </w:tblCellMar>
-        </w:tblPrEx>
         <w:tc>
           <w:tcPr>
             <w:tcW w:w="9026" w:type="dxa"/>
@@ -1765,8 +1571,9 @@
                 <w:szCs w:val="21"/>
                 <w:lang w:val="ru-RU"/>
               </w:rPr>
-              <w:t>Что это даёт:</w:t>
-            </w:r>
+              <w:t>Что это даёт</w:t>
+            </w:r>
+            <w:proofErr w:type="gramStart"/>
             <w:r>
               <w:rPr>
                 <w:rFonts w:ascii="Calibri" w:eastAsia="Calibri" w:hAnsi="Calibri" w:cs="Calibri"/>
@@ -1777,6 +1584,18 @@
                 <w:szCs w:val="21"/>
                 <w:lang w:val="ru-RU"/>
               </w:rPr>
+              <w:t>:</w:t>
+            </w:r>
+            <w:r>
+              <w:rPr>
+                <w:rFonts w:ascii="Calibri" w:eastAsia="Calibri" w:hAnsi="Calibri" w:cs="Calibri"/>
+                <w:b/>
+                <w:bCs/>
+                <w:color w:val="0E2430"/>
+                <w:sz w:val="21"/>
+                <w:szCs w:val="21"/>
+                <w:lang w:val="ru-RU"/>
+              </w:rPr>
               <w:t xml:space="preserve"> </w:t>
             </w:r>
             <w:r>
@@ -1787,7 +1606,18 @@
                 <w:szCs w:val="21"/>
                 <w:lang w:val="ru-RU"/>
               </w:rPr>
-              <w:t>Можно спокойно пробовать. Это главный страх любого, кому дают доступ к сайту, и здесь его нет.</w:t>
+              <w:t>Можно</w:t>
+            </w:r>
+            <w:proofErr w:type="gramEnd"/>
+            <w:r>
+              <w:rPr>
+                <w:rFonts w:ascii="Calibri" w:eastAsia="Calibri" w:hAnsi="Calibri" w:cs="Calibri"/>
+                <w:color w:val="20303A"/>
+                <w:sz w:val="21"/>
+                <w:szCs w:val="21"/>
+                <w:lang w:val="ru-RU"/>
+              </w:rPr>
+              <w:t xml:space="preserve"> спокойно пробовать. Это главный страх любого, кому дают доступ к сайту, и здесь его нет.</w:t>
             </w:r>
           </w:p>
         </w:tc>
@@ -1804,6 +1634,9 @@
     <w:p>
       <w:pPr>
         <w:spacing w:before="280" w:after="80"/>
+        <w:rPr>
+          <w:lang w:val="ru-RU"/>
+        </w:rPr>
       </w:pPr>
       <w:r>
         <w:rPr>
@@ -1845,7 +1678,47 @@
           <w:szCs w:val="22"/>
           <w:lang w:val="ru-RU"/>
         </w:rPr>
-        <w:t>Домики строками, дни колонками, каждая бронь — цветной полосой на свои даты. Навели — видно гостя, даты и сколько ночей; нажали — тут же правите. Отметили занятые даты, и они сразу пропали из свободных на сайте. Под таблицей на каждый день видно, сколько домиков ещё свободно.</w:t>
+        <w:t>Домики строками, дни колонками, каждая бронь</w:t>
+      </w:r>
+      <w:r>
+        <w:rPr>
+          <w:rFonts w:ascii="Calibri" w:eastAsia="Calibri" w:hAnsi="Calibri" w:cs="Calibri"/>
+          <w:color w:val="20303A"/>
+          <w:sz w:val="22"/>
+          <w:szCs w:val="22"/>
+          <w:lang w:val="ru-RU"/>
+        </w:rPr>
+        <w:t xml:space="preserve"> отражается</w:t>
+      </w:r>
+      <w:r>
+        <w:rPr>
+          <w:rFonts w:ascii="Calibri" w:eastAsia="Calibri" w:hAnsi="Calibri" w:cs="Calibri"/>
+          <w:color w:val="20303A"/>
+          <w:sz w:val="22"/>
+          <w:szCs w:val="22"/>
+          <w:lang w:val="ru-RU"/>
+        </w:rPr>
+        <w:t xml:space="preserve"> цветной полосой на свои даты. Навели — видно гостя, даты и сколько ночей; нажали </w:t>
+      </w:r>
+      <w:r>
+        <w:rPr>
+          <w:rFonts w:ascii="Calibri" w:eastAsia="Calibri" w:hAnsi="Calibri" w:cs="Calibri"/>
+          <w:color w:val="20303A"/>
+          <w:sz w:val="22"/>
+          <w:szCs w:val="22"/>
+          <w:lang w:val="ru-RU"/>
+        </w:rPr>
+        <w:t>и</w:t>
+      </w:r>
+      <w:r>
+        <w:rPr>
+          <w:rFonts w:ascii="Calibri" w:eastAsia="Calibri" w:hAnsi="Calibri" w:cs="Calibri"/>
+          <w:color w:val="20303A"/>
+          <w:sz w:val="22"/>
+          <w:szCs w:val="22"/>
+          <w:lang w:val="ru-RU"/>
+        </w:rPr>
+        <w:t xml:space="preserve"> тут же правите. Отметили занятые даты, и они сразу пропали из свободных на сайте. Под таблицей на каждый день видно, сколько домиков ещё свободно.</w:t>
       </w:r>
     </w:p>
     <w:tbl>
@@ -1869,12 +1742,6 @@
         <w:gridCol w:w="9026"/>
       </w:tblGrid>
       <w:tr>
-        <w:tblPrEx>
-          <w:tblCellMar>
-            <w:top w:w="0" w:type="dxa"/>
-            <w:bottom w:w="0" w:type="dxa"/>
-          </w:tblCellMar>
-        </w:tblPrEx>
         <w:tc>
           <w:tcPr>
             <w:tcW w:w="9026" w:type="dxa"/>
@@ -1922,7 +1789,17 @@
                 <w:szCs w:val="21"/>
                 <w:lang w:val="ru-RU"/>
               </w:rPr>
-              <w:t>анятость перестаёт жить в тетради и в голове. Сдать один домик двум гостям на одни числа нельзя даже случайно — система просто не даст такую бронь завести</w:t>
+              <w:t>анятость перестаёт жить в тетради и в голове. Сдать один домик двум гостям на одни числа нельзя даже случайно</w:t>
+            </w:r>
+            <w:r>
+              <w:rPr>
+                <w:rFonts w:ascii="Calibri" w:eastAsia="Calibri" w:hAnsi="Calibri" w:cs="Calibri"/>
+                <w:color w:val="20303A"/>
+                <w:sz w:val="21"/>
+                <w:szCs w:val="21"/>
+                <w:lang w:val="ru-RU"/>
+              </w:rPr>
+              <w:t>.</w:t>
             </w:r>
           </w:p>
         </w:tc>
@@ -1957,12 +1834,6 @@
         <w:gridCol w:w="9026"/>
       </w:tblGrid>
       <w:tr>
-        <w:tblPrEx>
-          <w:tblCellMar>
-            <w:top w:w="0" w:type="dxa"/>
-            <w:bottom w:w="0" w:type="dxa"/>
-          </w:tblCellMar>
-        </w:tblPrEx>
         <w:trPr>
           <w:trHeight w:val="2600"/>
         </w:trPr>
@@ -2058,116 +1929,48 @@
     <w:p>
       <w:pPr>
         <w:spacing w:after="140" w:line="300" w:lineRule="auto"/>
-      </w:pPr>
-      <w:r>
-        <w:rPr>
-          <w:rFonts w:ascii="Calibri" w:eastAsia="Calibri" w:hAnsi="Calibri" w:cs="Calibri"/>
-          <w:color w:val="20303A"/>
-          <w:sz w:val="22"/>
-          <w:szCs w:val="22"/>
-          <w:lang w:val="ru-RU"/>
-        </w:rPr>
-        <w:t xml:space="preserve">Все заявки лежат в панели. Новые подсвечены голубым и висят наверху, пока вы их не разберёте. Любую можно продублировать — постоянный гость едет второй раз, и не нужно переписывать всё заново. </w:t>
-      </w:r>
-      <w:proofErr w:type="spellStart"/>
-      <w:r>
-        <w:rPr>
-          <w:rFonts w:ascii="Calibri" w:eastAsia="Calibri" w:hAnsi="Calibri" w:cs="Calibri"/>
-          <w:color w:val="20303A"/>
-          <w:sz w:val="22"/>
-          <w:szCs w:val="22"/>
-        </w:rPr>
-        <w:t>Весь</w:t>
-      </w:r>
-      <w:proofErr w:type="spellEnd"/>
-      <w:r>
-        <w:rPr>
-          <w:rFonts w:ascii="Calibri" w:eastAsia="Calibri" w:hAnsi="Calibri" w:cs="Calibri"/>
-          <w:color w:val="20303A"/>
-          <w:sz w:val="22"/>
-          <w:szCs w:val="22"/>
-        </w:rPr>
-        <w:t xml:space="preserve"> </w:t>
-      </w:r>
-      <w:proofErr w:type="spellStart"/>
-      <w:r>
-        <w:rPr>
-          <w:rFonts w:ascii="Calibri" w:eastAsia="Calibri" w:hAnsi="Calibri" w:cs="Calibri"/>
-          <w:color w:val="20303A"/>
-          <w:sz w:val="22"/>
-          <w:szCs w:val="22"/>
-        </w:rPr>
-        <w:t>список</w:t>
-      </w:r>
-      <w:proofErr w:type="spellEnd"/>
-      <w:r>
-        <w:rPr>
-          <w:rFonts w:ascii="Calibri" w:eastAsia="Calibri" w:hAnsi="Calibri" w:cs="Calibri"/>
-          <w:color w:val="20303A"/>
-          <w:sz w:val="22"/>
-          <w:szCs w:val="22"/>
-        </w:rPr>
-        <w:t xml:space="preserve"> </w:t>
-      </w:r>
-      <w:proofErr w:type="spellStart"/>
-      <w:r>
-        <w:rPr>
-          <w:rFonts w:ascii="Calibri" w:eastAsia="Calibri" w:hAnsi="Calibri" w:cs="Calibri"/>
-          <w:color w:val="20303A"/>
-          <w:sz w:val="22"/>
-          <w:szCs w:val="22"/>
-        </w:rPr>
-        <w:t>выгружается</w:t>
-      </w:r>
-      <w:proofErr w:type="spellEnd"/>
-      <w:r>
-        <w:rPr>
-          <w:rFonts w:ascii="Calibri" w:eastAsia="Calibri" w:hAnsi="Calibri" w:cs="Calibri"/>
-          <w:color w:val="20303A"/>
-          <w:sz w:val="22"/>
-          <w:szCs w:val="22"/>
-        </w:rPr>
-        <w:t xml:space="preserve"> в Excel </w:t>
-      </w:r>
-      <w:proofErr w:type="spellStart"/>
-      <w:r>
-        <w:rPr>
-          <w:rFonts w:ascii="Calibri" w:eastAsia="Calibri" w:hAnsi="Calibri" w:cs="Calibri"/>
-          <w:color w:val="20303A"/>
-          <w:sz w:val="22"/>
-          <w:szCs w:val="22"/>
-        </w:rPr>
-        <w:t>одной</w:t>
-      </w:r>
-      <w:proofErr w:type="spellEnd"/>
-      <w:r>
-        <w:rPr>
-          <w:rFonts w:ascii="Calibri" w:eastAsia="Calibri" w:hAnsi="Calibri" w:cs="Calibri"/>
-          <w:color w:val="20303A"/>
-          <w:sz w:val="22"/>
-          <w:szCs w:val="22"/>
-        </w:rPr>
-        <w:t xml:space="preserve"> </w:t>
-      </w:r>
-      <w:proofErr w:type="spellStart"/>
-      <w:r>
-        <w:rPr>
-          <w:rFonts w:ascii="Calibri" w:eastAsia="Calibri" w:hAnsi="Calibri" w:cs="Calibri"/>
-          <w:color w:val="20303A"/>
-          <w:sz w:val="22"/>
-          <w:szCs w:val="22"/>
-        </w:rPr>
-        <w:t>кнопкой</w:t>
-      </w:r>
-      <w:proofErr w:type="spellEnd"/>
-      <w:r>
-        <w:rPr>
-          <w:rFonts w:ascii="Calibri" w:eastAsia="Calibri" w:hAnsi="Calibri" w:cs="Calibri"/>
-          <w:color w:val="20303A"/>
-          <w:sz w:val="22"/>
-          <w:szCs w:val="22"/>
-        </w:rPr>
-        <w:t>.</w:t>
+        <w:rPr>
+          <w:lang w:val="ru-RU"/>
+        </w:rPr>
+      </w:pPr>
+      <w:r>
+        <w:rPr>
+          <w:rFonts w:ascii="Calibri" w:eastAsia="Calibri" w:hAnsi="Calibri" w:cs="Calibri"/>
+          <w:color w:val="20303A"/>
+          <w:sz w:val="22"/>
+          <w:szCs w:val="22"/>
+          <w:lang w:val="ru-RU"/>
+        </w:rPr>
+        <w:t xml:space="preserve">Все заявки лежат в панели. Новые подсвечены голубым и висят наверху, пока вы их не разберёте. </w:t>
+      </w:r>
+      <w:r>
+        <w:rPr>
+          <w:rFonts w:ascii="Calibri" w:eastAsia="Calibri" w:hAnsi="Calibri" w:cs="Calibri"/>
+          <w:color w:val="20303A"/>
+          <w:sz w:val="22"/>
+          <w:szCs w:val="22"/>
+          <w:lang w:val="ru-RU"/>
+        </w:rPr>
+        <w:t xml:space="preserve">Весь список выгружается в </w:t>
+      </w:r>
+      <w:r>
+        <w:rPr>
+          <w:rFonts w:ascii="Calibri" w:eastAsia="Calibri" w:hAnsi="Calibri" w:cs="Calibri"/>
+          <w:color w:val="20303A"/>
+          <w:sz w:val="22"/>
+          <w:szCs w:val="22"/>
+        </w:rPr>
+        <w:t>Excel</w:t>
+      </w:r>
+      <w:r>
+        <w:rPr>
+          <w:rFonts w:ascii="Calibri" w:eastAsia="Calibri" w:hAnsi="Calibri" w:cs="Calibri"/>
+          <w:color w:val="20303A"/>
+          <w:sz w:val="22"/>
+          <w:szCs w:val="22"/>
+          <w:lang w:val="ru-RU"/>
+        </w:rPr>
+        <w:t xml:space="preserve"> одной кнопкой.</w:t>
       </w:r>
     </w:p>
     <w:tbl>
@@ -2191,12 +1994,6 @@
         <w:gridCol w:w="9026"/>
       </w:tblGrid>
       <w:tr>
-        <w:tblPrEx>
-          <w:tblCellMar>
-            <w:top w:w="0" w:type="dxa"/>
-            <w:bottom w:w="0" w:type="dxa"/>
-          </w:tblCellMar>
-        </w:tblPrEx>
         <w:tc>
           <w:tcPr>
             <w:tcW w:w="9026" w:type="dxa"/>
@@ -2493,6 +2290,9 @@
     <w:p>
       <w:pPr>
         <w:spacing w:after="140" w:line="300" w:lineRule="auto"/>
+        <w:rPr>
+          <w:lang w:val="ru-RU"/>
+        </w:rPr>
       </w:pPr>
       <w:r>
         <w:rPr>
@@ -2548,12 +2348,6 @@
         <w:gridCol w:w="9026"/>
       </w:tblGrid>
       <w:tr>
-        <w:tblPrEx>
-          <w:tblCellMar>
-            <w:top w:w="0" w:type="dxa"/>
-            <w:bottom w:w="0" w:type="dxa"/>
-          </w:tblCellMar>
-        </w:tblPrEx>
         <w:tc>
           <w:tcPr>
             <w:tcW w:w="9026" w:type="dxa"/>
@@ -2626,12 +2420,6 @@
         <w:gridCol w:w="9282"/>
       </w:tblGrid>
       <w:tr>
-        <w:tblPrEx>
-          <w:tblCellMar>
-            <w:top w:w="0" w:type="dxa"/>
-            <w:bottom w:w="0" w:type="dxa"/>
-          </w:tblCellMar>
-        </w:tblPrEx>
         <w:trPr>
           <w:trHeight w:val="2600"/>
         </w:trPr>
@@ -2654,6 +2442,7 @@
             </w:pPr>
             <w:r>
               <w:rPr>
+                <w:noProof/>
                 <w:lang w:val="ru-RU"/>
               </w:rPr>
               <w:drawing>
@@ -2728,423 +2517,8 @@
           <w:lang w:val="ru-RU"/>
         </w:rPr>
         <w:lastRenderedPageBreak/>
-        <w:t>Это не коробка — всё подстраивается под вас</w:t>
-      </w:r>
-    </w:p>
-    <w:p>
-      <w:pPr>
-        <w:spacing w:after="140" w:line="300" w:lineRule="auto"/>
-        <w:rPr>
-          <w:lang w:val="ru-RU"/>
-        </w:rPr>
-      </w:pPr>
-      <w:r>
-        <w:rPr>
-          <w:rFonts w:ascii="Calibri" w:eastAsia="Calibri" w:hAnsi="Calibri" w:cs="Calibri"/>
-          <w:color w:val="20303A"/>
-          <w:sz w:val="24"/>
-          <w:szCs w:val="24"/>
-          <w:lang w:val="ru-RU"/>
-        </w:rPr>
-        <w:t>Сайт написан с нуля под вашу базу, а не куплен готовым шаблоном. Поэтому почти всё в нём можно переделать под то, как вы привыкли работать, — а не наоборот.</w:t>
-      </w:r>
-    </w:p>
-    <w:p>
-      <w:pPr>
-        <w:pStyle w:val="2"/>
-        <w:spacing w:before="260" w:after="120"/>
-        <w:rPr>
-          <w:lang w:val="ru-RU"/>
-        </w:rPr>
-      </w:pPr>
-      <w:r>
-        <w:rPr>
-          <w:rFonts w:ascii="Calibri" w:eastAsia="Calibri" w:hAnsi="Calibri" w:cs="Calibri"/>
-          <w:b/>
-          <w:bCs/>
-          <w:color w:val="2F7A5E"/>
-          <w:lang w:val="ru-RU"/>
-        </w:rPr>
-        <w:t>График броней — в первую очередь</w:t>
-      </w:r>
-    </w:p>
-    <w:p>
-      <w:pPr>
-        <w:spacing w:after="140" w:line="300" w:lineRule="auto"/>
-        <w:rPr>
-          <w:lang w:val="ru-RU"/>
-        </w:rPr>
-      </w:pPr>
-      <w:r>
-        <w:rPr>
-          <w:rFonts w:ascii="Calibri" w:eastAsia="Calibri" w:hAnsi="Calibri" w:cs="Calibri"/>
-          <w:color w:val="20303A"/>
-          <w:sz w:val="22"/>
-          <w:szCs w:val="22"/>
-          <w:lang w:val="ru-RU"/>
-        </w:rPr>
-        <w:t>Сейчас он сделан так, как это устроено в системах бронирования: домики строками, дни месяца колонками, бронь — сплошная полоса. Но это только отправная точка. Скажете, как удобнее вам, — переделаю:</w:t>
-      </w:r>
-    </w:p>
-    <w:p>
-      <w:pPr>
-        <w:pStyle w:val="a4"/>
-        <w:numPr>
-          <w:ilvl w:val="0"/>
-          <w:numId w:val="2"/>
-        </w:numPr>
-        <w:spacing w:after="90" w:line="290" w:lineRule="auto"/>
-        <w:rPr>
-          <w:lang w:val="ru-RU"/>
-        </w:rPr>
-      </w:pPr>
-      <w:r>
-        <w:rPr>
-          <w:rFonts w:ascii="Calibri" w:eastAsia="Calibri" w:hAnsi="Calibri" w:cs="Calibri"/>
-          <w:color w:val="20303A"/>
-          <w:sz w:val="22"/>
-          <w:szCs w:val="22"/>
-          <w:lang w:val="ru-RU"/>
-        </w:rPr>
-        <w:t>Показывать неделю, две недели, месяц или сразу сезон.</w:t>
-      </w:r>
-    </w:p>
-    <w:p>
-      <w:pPr>
-        <w:pStyle w:val="a4"/>
-        <w:numPr>
-          <w:ilvl w:val="0"/>
-          <w:numId w:val="2"/>
-        </w:numPr>
-        <w:spacing w:after="90" w:line="290" w:lineRule="auto"/>
-        <w:rPr>
-          <w:lang w:val="ru-RU"/>
-        </w:rPr>
-      </w:pPr>
-      <w:r>
-        <w:rPr>
-          <w:rFonts w:ascii="Calibri" w:eastAsia="Calibri" w:hAnsi="Calibri" w:cs="Calibri"/>
-          <w:color w:val="20303A"/>
-          <w:sz w:val="22"/>
-          <w:szCs w:val="22"/>
-          <w:lang w:val="ru-RU"/>
-        </w:rPr>
-        <w:t>Свои цвета и обозначения: предоплата внесена, ждём подтверждения, гость на месте, выехал.</w:t>
-      </w:r>
-    </w:p>
-    <w:p>
-      <w:pPr>
-        <w:pStyle w:val="a4"/>
-        <w:numPr>
-          <w:ilvl w:val="0"/>
-          <w:numId w:val="2"/>
-        </w:numPr>
-        <w:spacing w:after="90" w:line="290" w:lineRule="auto"/>
-        <w:rPr>
-          <w:lang w:val="ru-RU"/>
-        </w:rPr>
-      </w:pPr>
-      <w:r>
-        <w:rPr>
-          <w:rFonts w:ascii="Calibri" w:eastAsia="Calibri" w:hAnsi="Calibri" w:cs="Calibri"/>
-          <w:color w:val="20303A"/>
-          <w:sz w:val="22"/>
-          <w:szCs w:val="22"/>
-          <w:lang w:val="ru-RU"/>
-        </w:rPr>
-        <w:t>Выводить прямо в полосе то, что важно вам: имя, телефон, число гостей, сумму, есть ли баня и питание.</w:t>
-      </w:r>
-    </w:p>
-    <w:p>
-      <w:pPr>
-        <w:pStyle w:val="a4"/>
-        <w:numPr>
-          <w:ilvl w:val="0"/>
-          <w:numId w:val="2"/>
-        </w:numPr>
-        <w:spacing w:after="90" w:line="290" w:lineRule="auto"/>
-        <w:rPr>
-          <w:lang w:val="ru-RU"/>
-        </w:rPr>
-      </w:pPr>
-      <w:r>
-        <w:rPr>
-          <w:rFonts w:ascii="Calibri" w:eastAsia="Calibri" w:hAnsi="Calibri" w:cs="Calibri"/>
-          <w:color w:val="20303A"/>
-          <w:sz w:val="22"/>
-          <w:szCs w:val="22"/>
-          <w:lang w:val="ru-RU"/>
-        </w:rPr>
-        <w:t>Добавить свои поля в бронь — залог, номер машины, кто из ваших встречает группу.</w:t>
-      </w:r>
-    </w:p>
-    <w:p>
-      <w:pPr>
-        <w:pStyle w:val="a4"/>
-        <w:numPr>
-          <w:ilvl w:val="0"/>
-          <w:numId w:val="2"/>
-        </w:numPr>
-        <w:spacing w:after="90" w:line="290" w:lineRule="auto"/>
-        <w:rPr>
-          <w:lang w:val="ru-RU"/>
-        </w:rPr>
-      </w:pPr>
-      <w:r>
-        <w:rPr>
-          <w:rFonts w:ascii="Calibri" w:eastAsia="Calibri" w:hAnsi="Calibri" w:cs="Calibri"/>
-          <w:color w:val="20303A"/>
-          <w:sz w:val="22"/>
-          <w:szCs w:val="22"/>
-          <w:lang w:val="ru-RU"/>
-        </w:rPr>
-        <w:t>Считать не только домики и вездеход, а всё, что у вас ограничено: места в бане, порции завтраков, снегоходы.</w:t>
-      </w:r>
-    </w:p>
-    <w:p>
-      <w:pPr>
-        <w:pStyle w:val="a4"/>
-        <w:numPr>
-          <w:ilvl w:val="0"/>
-          <w:numId w:val="2"/>
-        </w:numPr>
-        <w:spacing w:after="90" w:line="290" w:lineRule="auto"/>
-        <w:rPr>
-          <w:lang w:val="ru-RU"/>
-        </w:rPr>
-      </w:pPr>
-      <w:r>
-        <w:rPr>
-          <w:rFonts w:ascii="Calibri" w:eastAsia="Calibri" w:hAnsi="Calibri" w:cs="Calibri"/>
-          <w:color w:val="20303A"/>
-          <w:sz w:val="22"/>
-          <w:szCs w:val="22"/>
-          <w:lang w:val="ru-RU"/>
-        </w:rPr>
-        <w:t>Выгрузку по любому срезу: занятость за месяц, выручка по домикам, загрузка по сезонам.</w:t>
-      </w:r>
-    </w:p>
-    <w:p>
-      <w:pPr>
-        <w:pStyle w:val="2"/>
-        <w:spacing w:before="260" w:after="120"/>
-      </w:pPr>
-      <w:r>
-        <w:rPr>
-          <w:rFonts w:ascii="Calibri" w:eastAsia="Calibri" w:hAnsi="Calibri" w:cs="Calibri"/>
-          <w:b/>
-          <w:bCs/>
-          <w:color w:val="2F7A5E"/>
-        </w:rPr>
-        <w:t xml:space="preserve">И </w:t>
-      </w:r>
-      <w:proofErr w:type="spellStart"/>
-      <w:r>
-        <w:rPr>
-          <w:rFonts w:ascii="Calibri" w:eastAsia="Calibri" w:hAnsi="Calibri" w:cs="Calibri"/>
-          <w:b/>
-          <w:bCs/>
-          <w:color w:val="2F7A5E"/>
-        </w:rPr>
-        <w:t>всё</w:t>
-      </w:r>
-      <w:proofErr w:type="spellEnd"/>
-      <w:r>
-        <w:rPr>
-          <w:rFonts w:ascii="Calibri" w:eastAsia="Calibri" w:hAnsi="Calibri" w:cs="Calibri"/>
-          <w:b/>
-          <w:bCs/>
-          <w:color w:val="2F7A5E"/>
-        </w:rPr>
-        <w:t xml:space="preserve"> </w:t>
-      </w:r>
-      <w:proofErr w:type="spellStart"/>
-      <w:r>
-        <w:rPr>
-          <w:rFonts w:ascii="Calibri" w:eastAsia="Calibri" w:hAnsi="Calibri" w:cs="Calibri"/>
-          <w:b/>
-          <w:bCs/>
-          <w:color w:val="2F7A5E"/>
-        </w:rPr>
-        <w:t>остальное</w:t>
-      </w:r>
-      <w:proofErr w:type="spellEnd"/>
-      <w:r>
-        <w:rPr>
-          <w:rFonts w:ascii="Calibri" w:eastAsia="Calibri" w:hAnsi="Calibri" w:cs="Calibri"/>
-          <w:b/>
-          <w:bCs/>
-          <w:color w:val="2F7A5E"/>
-        </w:rPr>
-        <w:t xml:space="preserve"> </w:t>
-      </w:r>
-      <w:proofErr w:type="spellStart"/>
-      <w:r>
-        <w:rPr>
-          <w:rFonts w:ascii="Calibri" w:eastAsia="Calibri" w:hAnsi="Calibri" w:cs="Calibri"/>
-          <w:b/>
-          <w:bCs/>
-          <w:color w:val="2F7A5E"/>
-        </w:rPr>
-        <w:t>тоже</w:t>
-      </w:r>
-      <w:proofErr w:type="spellEnd"/>
-    </w:p>
-    <w:p>
-      <w:pPr>
-        <w:pStyle w:val="a4"/>
-        <w:numPr>
-          <w:ilvl w:val="0"/>
-          <w:numId w:val="2"/>
-        </w:numPr>
-        <w:spacing w:after="90" w:line="290" w:lineRule="auto"/>
-        <w:rPr>
-          <w:lang w:val="ru-RU"/>
-        </w:rPr>
-      </w:pPr>
-      <w:r>
-        <w:rPr>
-          <w:rFonts w:ascii="Calibri" w:eastAsia="Calibri" w:hAnsi="Calibri" w:cs="Calibri"/>
-          <w:color w:val="20303A"/>
-          <w:sz w:val="22"/>
-          <w:szCs w:val="22"/>
-          <w:lang w:val="ru-RU"/>
-        </w:rPr>
-        <w:t>Поля в заявке: убрать лишние, добавить свои — например, «откуда едете» или «нужен трансфер из Мурманска».</w:t>
-      </w:r>
-    </w:p>
-    <w:p>
-      <w:pPr>
-        <w:pStyle w:val="a4"/>
-        <w:numPr>
-          <w:ilvl w:val="0"/>
-          <w:numId w:val="2"/>
-        </w:numPr>
-        <w:spacing w:after="90" w:line="290" w:lineRule="auto"/>
-        <w:rPr>
-          <w:lang w:val="ru-RU"/>
-        </w:rPr>
-      </w:pPr>
-      <w:r>
-        <w:rPr>
-          <w:rFonts w:ascii="Calibri" w:eastAsia="Calibri" w:hAnsi="Calibri" w:cs="Calibri"/>
-          <w:color w:val="20303A"/>
-          <w:sz w:val="22"/>
-          <w:szCs w:val="22"/>
-          <w:lang w:val="ru-RU"/>
-        </w:rPr>
-        <w:t>Новые разделы сайта: акции, корпоративы, рыбалка, зимние туры — что угодно.</w:t>
-      </w:r>
-    </w:p>
-    <w:p>
-      <w:pPr>
-        <w:pStyle w:val="a4"/>
-        <w:numPr>
-          <w:ilvl w:val="0"/>
-          <w:numId w:val="2"/>
-        </w:numPr>
-        <w:spacing w:after="90" w:line="290" w:lineRule="auto"/>
-        <w:rPr>
-          <w:lang w:val="ru-RU"/>
-        </w:rPr>
-      </w:pPr>
-      <w:r>
-        <w:rPr>
-          <w:rFonts w:ascii="Calibri" w:eastAsia="Calibri" w:hAnsi="Calibri" w:cs="Calibri"/>
-          <w:color w:val="20303A"/>
-          <w:sz w:val="22"/>
-          <w:szCs w:val="22"/>
-          <w:lang w:val="ru-RU"/>
-        </w:rPr>
-        <w:t>Разные права: себе полный доступ, помощнику — только заявки и занятость, без цен и текстов.</w:t>
-      </w:r>
-    </w:p>
-    <w:p>
-      <w:pPr>
-        <w:pStyle w:val="a4"/>
-        <w:numPr>
-          <w:ilvl w:val="0"/>
-          <w:numId w:val="2"/>
-        </w:numPr>
-        <w:spacing w:after="90" w:line="290" w:lineRule="auto"/>
-        <w:rPr>
-          <w:lang w:val="ru-RU"/>
-        </w:rPr>
-      </w:pPr>
-      <w:r>
-        <w:rPr>
-          <w:rFonts w:ascii="Calibri" w:eastAsia="Calibri" w:hAnsi="Calibri" w:cs="Calibri"/>
-          <w:color w:val="20303A"/>
-          <w:sz w:val="22"/>
-          <w:szCs w:val="22"/>
-          <w:lang w:val="ru-RU"/>
-        </w:rPr>
-        <w:t>Напоминания: за день до заезда, о неотвеченной заявке, о заканчивающейся брони.</w:t>
-      </w:r>
-    </w:p>
-    <w:p>
-      <w:pPr>
-        <w:pBdr>
-          <w:bottom w:val="single" w:sz="6" w:space="0" w:color="D6E0DA"/>
-        </w:pBdr>
-        <w:spacing w:before="120" w:after="200"/>
-        <w:rPr>
-          <w:lang w:val="ru-RU"/>
-        </w:rPr>
-      </w:pPr>
-    </w:p>
-    <w:p>
-      <w:pPr>
-        <w:spacing w:after="140" w:line="300" w:lineRule="auto"/>
-        <w:rPr>
-          <w:lang w:val="ru-RU"/>
-        </w:rPr>
-      </w:pPr>
-      <w:r>
-        <w:rPr>
-          <w:rFonts w:ascii="Calibri" w:eastAsia="Calibri" w:hAnsi="Calibri" w:cs="Calibri"/>
-          <w:b/>
-          <w:bCs/>
-          <w:color w:val="20303A"/>
-          <w:sz w:val="24"/>
-          <w:szCs w:val="24"/>
-          <w:lang w:val="ru-RU"/>
-        </w:rPr>
-        <w:t>Правило простое: если вы говорите «мне бы вот тут видеть ещё вот это» — так и сдела</w:t>
-      </w:r>
-      <w:r>
-        <w:rPr>
-          <w:rFonts w:ascii="Calibri" w:eastAsia="Calibri" w:hAnsi="Calibri" w:cs="Calibri"/>
-          <w:b/>
-          <w:bCs/>
-          <w:color w:val="20303A"/>
-          <w:sz w:val="24"/>
-          <w:szCs w:val="24"/>
-          <w:lang w:val="ru-RU"/>
-        </w:rPr>
-        <w:t>ю</w:t>
-      </w:r>
-      <w:r>
-        <w:rPr>
-          <w:rFonts w:ascii="Calibri" w:eastAsia="Calibri" w:hAnsi="Calibri" w:cs="Calibri"/>
-          <w:b/>
-          <w:bCs/>
-          <w:color w:val="20303A"/>
-          <w:sz w:val="24"/>
-          <w:szCs w:val="24"/>
-          <w:lang w:val="ru-RU"/>
-        </w:rPr>
-        <w:t>. Сайт подстраивается под вашу работу, а не вы под сайт.</w:t>
-      </w:r>
-    </w:p>
-    <w:p>
-      <w:pPr>
-        <w:pStyle w:val="1"/>
-        <w:spacing w:before="240" w:after="200"/>
-        <w:rPr>
-          <w:lang w:val="ru-RU"/>
-        </w:rPr>
-      </w:pPr>
+        <w:t>Все можно изменить</w:t>
+      </w:r>
       <w:r>
         <w:rPr>
           <w:rFonts w:ascii="Calibri" w:eastAsia="Calibri" w:hAnsi="Calibri" w:cs="Calibri"/>
@@ -3155,7 +2529,7 @@
           <w:szCs w:val="34"/>
           <w:lang w:val="ru-RU"/>
         </w:rPr>
-        <w:t>Как выглядит ваш день</w:t>
+        <w:t xml:space="preserve"> под вас</w:t>
       </w:r>
     </w:p>
     <w:p>
@@ -3169,30 +2543,41 @@
         <w:rPr>
           <w:rFonts w:ascii="Calibri" w:eastAsia="Calibri" w:hAnsi="Calibri" w:cs="Calibri"/>
           <w:color w:val="20303A"/>
-          <w:sz w:val="22"/>
-          <w:szCs w:val="22"/>
-          <w:lang w:val="ru-RU"/>
-        </w:rPr>
-        <w:t xml:space="preserve">Утро. Пришло уведомление в </w:t>
-      </w:r>
-      <w:r>
-        <w:rPr>
-          <w:rFonts w:ascii="Calibri" w:eastAsia="Calibri" w:hAnsi="Calibri" w:cs="Calibri"/>
-          <w:color w:val="20303A"/>
-          <w:sz w:val="22"/>
-          <w:szCs w:val="22"/>
-        </w:rPr>
-        <w:t>Telegram</w:t>
-      </w:r>
-      <w:r>
-        <w:rPr>
-          <w:rFonts w:ascii="Calibri" w:eastAsia="Calibri" w:hAnsi="Calibri" w:cs="Calibri"/>
-          <w:color w:val="20303A"/>
-          <w:sz w:val="22"/>
-          <w:szCs w:val="22"/>
-          <w:lang w:val="ru-RU"/>
-        </w:rPr>
-        <w:t>: «Ольга, +7 921…, Рыбачий, 12–15 сентября, 4 гостя, нужна баня». Вы звоните, договариваетесь.</w:t>
+          <w:sz w:val="24"/>
+          <w:szCs w:val="24"/>
+          <w:lang w:val="ru-RU"/>
+        </w:rPr>
+        <w:t xml:space="preserve">Почти </w:t>
+      </w:r>
+      <w:r>
+        <w:rPr>
+          <w:rFonts w:ascii="Calibri" w:eastAsia="Calibri" w:hAnsi="Calibri" w:cs="Calibri"/>
+          <w:color w:val="20303A"/>
+          <w:sz w:val="24"/>
+          <w:szCs w:val="24"/>
+          <w:lang w:val="ru-RU"/>
+        </w:rPr>
+        <w:t>всё в нём можно переделать под то, как в</w:t>
+      </w:r>
+      <w:r>
+        <w:rPr>
+          <w:rFonts w:ascii="Calibri" w:eastAsia="Calibri" w:hAnsi="Calibri" w:cs="Calibri"/>
+          <w:color w:val="20303A"/>
+          <w:sz w:val="24"/>
+          <w:szCs w:val="24"/>
+          <w:lang w:val="ru-RU"/>
+        </w:rPr>
+        <w:t xml:space="preserve">ам удобно </w:t>
+      </w:r>
+      <w:r>
+        <w:rPr>
+          <w:rFonts w:ascii="Calibri" w:eastAsia="Calibri" w:hAnsi="Calibri" w:cs="Calibri"/>
+          <w:color w:val="20303A"/>
+          <w:sz w:val="24"/>
+          <w:szCs w:val="24"/>
+          <w:lang w:val="ru-RU"/>
+        </w:rPr>
+        <w:t>работать.</w:t>
       </w:r>
     </w:p>
     <w:p>
@@ -3205,60 +2590,51 @@
       <w:r>
         <w:rPr>
           <w:rFonts w:ascii="Calibri" w:eastAsia="Calibri" w:hAnsi="Calibri" w:cs="Calibri"/>
-          <w:color w:val="20303A"/>
-          <w:sz w:val="22"/>
-          <w:szCs w:val="22"/>
-          <w:lang w:val="ru-RU"/>
-        </w:rPr>
-        <w:t>Открываете панель на телефоне, в разделе «Занятость» отмечаете эти даты за домиком. Всё — на сайте они уже заняты, следующий гость их не выберет.</w:t>
-      </w:r>
-    </w:p>
-    <w:p>
-      <w:pPr>
-        <w:spacing w:after="140" w:line="300" w:lineRule="auto"/>
-        <w:rPr>
-          <w:lang w:val="ru-RU"/>
-        </w:rPr>
-      </w:pPr>
-      <w:r>
-        <w:rPr>
-          <w:rFonts w:ascii="Calibri" w:eastAsia="Calibri" w:hAnsi="Calibri" w:cs="Calibri"/>
-          <w:color w:val="20303A"/>
-          <w:sz w:val="22"/>
-          <w:szCs w:val="22"/>
-          <w:lang w:val="ru-RU"/>
-        </w:rPr>
-        <w:t>Вечером решили поднять цену на баню. Заходите в «Цены», меняете число, сохраняете. Через пятнадцать секунд новая цена на сайте.</w:t>
-      </w:r>
-    </w:p>
-    <w:p>
-      <w:pPr>
-        <w:spacing w:after="140" w:line="300" w:lineRule="auto"/>
-        <w:rPr>
-          <w:lang w:val="ru-RU"/>
-        </w:rPr>
-      </w:pPr>
-      <w:r>
-        <w:rPr>
-          <w:rFonts w:ascii="Calibri" w:eastAsia="Calibri" w:hAnsi="Calibri" w:cs="Calibri"/>
-          <w:color w:val="20303A"/>
-          <w:sz w:val="22"/>
-          <w:szCs w:val="22"/>
-          <w:lang w:val="ru-RU"/>
-        </w:rPr>
-        <w:t>Всё. Никаких звонков, никакого ожидания, никаких «поправлю на выходных».</w:t>
-      </w:r>
-    </w:p>
-    <w:p>
-      <w:pPr>
-        <w:pBdr>
-          <w:bottom w:val="single" w:sz="6" w:space="0" w:color="D6E0DA"/>
-        </w:pBdr>
-        <w:spacing w:before="120" w:after="200"/>
-        <w:rPr>
-          <w:lang w:val="ru-RU"/>
-        </w:rPr>
-      </w:pPr>
+          <w:b/>
+          <w:bCs/>
+          <w:color w:val="20303A"/>
+          <w:sz w:val="24"/>
+          <w:szCs w:val="24"/>
+          <w:lang w:val="ru-RU"/>
+        </w:rPr>
+        <w:t>Если</w:t>
+      </w:r>
+      <w:r>
+        <w:rPr>
+          <w:rFonts w:ascii="Calibri" w:eastAsia="Calibri" w:hAnsi="Calibri" w:cs="Calibri"/>
+          <w:b/>
+          <w:bCs/>
+          <w:color w:val="20303A"/>
+          <w:sz w:val="24"/>
+          <w:szCs w:val="24"/>
+          <w:lang w:val="ru-RU"/>
+        </w:rPr>
+        <w:t xml:space="preserve"> вы говорите «мне бы вот тут видеть ещё вот это» — так и сдела</w:t>
+      </w:r>
+      <w:r>
+        <w:rPr>
+          <w:rFonts w:ascii="Calibri" w:eastAsia="Calibri" w:hAnsi="Calibri" w:cs="Calibri"/>
+          <w:b/>
+          <w:bCs/>
+          <w:color w:val="20303A"/>
+          <w:sz w:val="24"/>
+          <w:szCs w:val="24"/>
+          <w:lang w:val="ru-RU"/>
+        </w:rPr>
+        <w:t>ю</w:t>
+      </w:r>
+      <w:r>
+        <w:rPr>
+          <w:rFonts w:ascii="Calibri" w:eastAsia="Calibri" w:hAnsi="Calibri" w:cs="Calibri"/>
+          <w:b/>
+          <w:bCs/>
+          <w:color w:val="20303A"/>
+          <w:sz w:val="24"/>
+          <w:szCs w:val="24"/>
+          <w:lang w:val="ru-RU"/>
+        </w:rPr>
+        <w:t xml:space="preserve">. </w:t>
+      </w:r>
     </w:p>
     <w:p>
       <w:pPr>
@@ -3278,65 +2654,99 @@
           <w:szCs w:val="34"/>
           <w:lang w:val="ru-RU"/>
         </w:rPr>
-        <w:t>Что нужно от вас, чтобы запустить</w:t>
-      </w:r>
-    </w:p>
-    <w:p>
-      <w:pPr>
-        <w:pStyle w:val="a4"/>
-        <w:numPr>
-          <w:ilvl w:val="0"/>
-          <w:numId w:val="2"/>
-        </w:numPr>
-        <w:spacing w:after="90" w:line="290" w:lineRule="auto"/>
-        <w:rPr>
-          <w:lang w:val="ru-RU"/>
-        </w:rPr>
-      </w:pPr>
-      <w:r>
-        <w:rPr>
-          <w:rFonts w:ascii="Calibri" w:eastAsia="Calibri" w:hAnsi="Calibri" w:cs="Calibri"/>
-          <w:color w:val="20303A"/>
-          <w:sz w:val="22"/>
-          <w:szCs w:val="22"/>
-          <w:lang w:val="ru-RU"/>
-        </w:rPr>
-        <w:t>Полчаса на живой показ — я проведу по панели и дам вам самому всё потыкать.</w:t>
-      </w:r>
-    </w:p>
-    <w:p>
-      <w:pPr>
-        <w:pStyle w:val="a4"/>
-        <w:numPr>
-          <w:ilvl w:val="0"/>
-          <w:numId w:val="2"/>
-        </w:numPr>
-        <w:spacing w:after="90" w:line="290" w:lineRule="auto"/>
-        <w:rPr>
-          <w:lang w:val="ru-RU"/>
-        </w:rPr>
-      </w:pPr>
-      <w:r>
-        <w:rPr>
-          <w:rFonts w:ascii="Calibri" w:eastAsia="Calibri" w:hAnsi="Calibri" w:cs="Calibri"/>
-          <w:color w:val="20303A"/>
-          <w:sz w:val="22"/>
-          <w:szCs w:val="22"/>
-          <w:lang w:val="ru-RU"/>
-        </w:rPr>
-        <w:t xml:space="preserve">Доступ к домену </w:t>
-      </w:r>
-      <w:proofErr w:type="spellStart"/>
-      <w:r>
-        <w:rPr>
-          <w:rFonts w:ascii="Calibri" w:eastAsia="Calibri" w:hAnsi="Calibri" w:cs="Calibri"/>
-          <w:color w:val="20303A"/>
-          <w:sz w:val="22"/>
-          <w:szCs w:val="22"/>
-        </w:rPr>
-        <w:t>nordbase</w:t>
-      </w:r>
-      <w:proofErr w:type="spellEnd"/>
+        <w:t>Пример</w:t>
+      </w:r>
+    </w:p>
+    <w:p>
+      <w:pPr>
+        <w:spacing w:after="140" w:line="300" w:lineRule="auto"/>
+        <w:rPr>
+          <w:lang w:val="ru-RU"/>
+        </w:rPr>
+      </w:pPr>
+      <w:r>
+        <w:rPr>
+          <w:rFonts w:ascii="Calibri" w:eastAsia="Calibri" w:hAnsi="Calibri" w:cs="Calibri"/>
+          <w:color w:val="20303A"/>
+          <w:sz w:val="22"/>
+          <w:szCs w:val="22"/>
+          <w:lang w:val="ru-RU"/>
+        </w:rPr>
+        <w:t xml:space="preserve">Утро. Пришло уведомление в </w:t>
+      </w:r>
+      <w:r>
+        <w:rPr>
+          <w:rFonts w:ascii="Calibri" w:eastAsia="Calibri" w:hAnsi="Calibri" w:cs="Calibri"/>
+          <w:color w:val="20303A"/>
+          <w:sz w:val="22"/>
+          <w:szCs w:val="22"/>
+        </w:rPr>
+        <w:t>Telegram</w:t>
+      </w:r>
+      <w:r>
+        <w:rPr>
+          <w:rFonts w:ascii="Calibri" w:eastAsia="Calibri" w:hAnsi="Calibri" w:cs="Calibri"/>
+          <w:color w:val="20303A"/>
+          <w:sz w:val="22"/>
+          <w:szCs w:val="22"/>
+          <w:lang w:val="ru-RU"/>
+        </w:rPr>
+        <w:t>: «Ольга, +7 921…, Рыбачий, 12–15 сентября, 4 гостя, нужна баня». Вы звоните, договариваетесь.</w:t>
+      </w:r>
+    </w:p>
+    <w:p>
+      <w:pPr>
+        <w:spacing w:after="140" w:line="300" w:lineRule="auto"/>
+        <w:rPr>
+          <w:lang w:val="ru-RU"/>
+        </w:rPr>
+      </w:pPr>
+      <w:r>
+        <w:rPr>
+          <w:rFonts w:ascii="Calibri" w:eastAsia="Calibri" w:hAnsi="Calibri" w:cs="Calibri"/>
+          <w:color w:val="20303A"/>
+          <w:sz w:val="22"/>
+          <w:szCs w:val="22"/>
+          <w:lang w:val="ru-RU"/>
+        </w:rPr>
+        <w:t>Открываете панель на телефоне, в разделе «Занятость» отмечаете эти даты за домиком. Всё — на сайте они уже заняты, следующий гость их не выберет.</w:t>
+      </w:r>
+    </w:p>
+    <w:p>
+      <w:pPr>
+        <w:spacing w:after="140" w:line="300" w:lineRule="auto"/>
+        <w:rPr>
+          <w:lang w:val="ru-RU"/>
+        </w:rPr>
+      </w:pPr>
+      <w:r>
+        <w:rPr>
+          <w:rFonts w:ascii="Calibri" w:eastAsia="Calibri" w:hAnsi="Calibri" w:cs="Calibri"/>
+          <w:color w:val="20303A"/>
+          <w:sz w:val="22"/>
+          <w:szCs w:val="22"/>
+          <w:lang w:val="ru-RU"/>
+        </w:rPr>
+        <w:t>Вечером решили поднять цену на баню. Заходите в «Цены», меняете число, сохраняете. Через пятнадцать секунд новая цена на сайте.</w:t>
+      </w:r>
+    </w:p>
+    <w:p>
+      <w:pPr>
+        <w:spacing w:after="140" w:line="300" w:lineRule="auto"/>
+        <w:rPr>
+          <w:lang w:val="ru-RU"/>
+        </w:rPr>
+      </w:pPr>
+      <w:r>
+        <w:rPr>
+          <w:rFonts w:ascii="Calibri" w:eastAsia="Calibri" w:hAnsi="Calibri" w:cs="Calibri"/>
+          <w:color w:val="20303A"/>
+          <w:sz w:val="22"/>
+          <w:szCs w:val="22"/>
+          <w:lang w:val="ru-RU"/>
+        </w:rPr>
+        <w:t>Всё. Никаких звонков, никакого ожидания</w:t>
+      </w:r>
       <w:r>
         <w:rPr>
           <w:rFonts w:ascii="Calibri" w:eastAsia="Calibri" w:hAnsi="Calibri" w:cs="Calibri"/>
@@ -3346,114 +2756,12 @@
           <w:lang w:val="ru-RU"/>
         </w:rPr>
         <w:t>.</w:t>
-      </w:r>
-      <w:proofErr w:type="spellStart"/>
-      <w:r>
-        <w:rPr>
-          <w:rFonts w:ascii="Calibri" w:eastAsia="Calibri" w:hAnsi="Calibri" w:cs="Calibri"/>
-          <w:color w:val="20303A"/>
-          <w:sz w:val="22"/>
-          <w:szCs w:val="22"/>
-        </w:rPr>
-        <w:t>ru</w:t>
-      </w:r>
-      <w:proofErr w:type="spellEnd"/>
-      <w:r>
-        <w:rPr>
-          <w:rFonts w:ascii="Calibri" w:eastAsia="Calibri" w:hAnsi="Calibri" w:cs="Calibri"/>
-          <w:color w:val="20303A"/>
-          <w:sz w:val="22"/>
-          <w:szCs w:val="22"/>
-          <w:lang w:val="ru-RU"/>
-        </w:rPr>
-        <w:t>. Адреса старых страниц сохранены, позиции в поиске не потеряются.</w:t>
-      </w:r>
-    </w:p>
-    <w:p>
-      <w:pPr>
-        <w:pStyle w:val="a4"/>
-        <w:numPr>
-          <w:ilvl w:val="0"/>
-          <w:numId w:val="2"/>
-        </w:numPr>
-        <w:spacing w:after="90" w:line="290" w:lineRule="auto"/>
-        <w:rPr>
-          <w:lang w:val="ru-RU"/>
-        </w:rPr>
-      </w:pPr>
-      <w:r>
-        <w:rPr>
-          <w:rFonts w:ascii="Calibri" w:eastAsia="Calibri" w:hAnsi="Calibri" w:cs="Calibri"/>
-          <w:color w:val="20303A"/>
-          <w:sz w:val="22"/>
-          <w:szCs w:val="22"/>
-        </w:rPr>
-        <w:t>Telegram</w:t>
-      </w:r>
-      <w:r>
-        <w:rPr>
-          <w:rFonts w:ascii="Calibri" w:eastAsia="Calibri" w:hAnsi="Calibri" w:cs="Calibri"/>
-          <w:color w:val="20303A"/>
-          <w:sz w:val="22"/>
-          <w:szCs w:val="22"/>
-          <w:lang w:val="ru-RU"/>
-        </w:rPr>
-        <w:t>-бот для уведомлений — заведём вместе за три минуты.</w:t>
-      </w:r>
-    </w:p>
-    <w:p>
-      <w:pPr>
-        <w:pStyle w:val="a4"/>
-        <w:numPr>
-          <w:ilvl w:val="0"/>
-          <w:numId w:val="2"/>
-        </w:numPr>
-        <w:spacing w:after="90" w:line="290" w:lineRule="auto"/>
-        <w:rPr>
-          <w:lang w:val="ru-RU"/>
-        </w:rPr>
-      </w:pPr>
-      <w:r>
-        <w:rPr>
-          <w:rFonts w:ascii="Calibri" w:eastAsia="Calibri" w:hAnsi="Calibri" w:cs="Calibri"/>
-          <w:color w:val="20303A"/>
-          <w:sz w:val="22"/>
-          <w:szCs w:val="22"/>
-          <w:lang w:val="ru-RU"/>
-        </w:rPr>
-        <w:t>Фотографии в хорошем качестве, если есть. Пока стоят те, что были на старом сайте.</w:t>
-      </w:r>
-    </w:p>
-    <w:p>
-      <w:pPr>
-        <w:pStyle w:val="a4"/>
-        <w:numPr>
-          <w:ilvl w:val="0"/>
-          <w:numId w:val="2"/>
-        </w:numPr>
-        <w:spacing w:after="90" w:line="290" w:lineRule="auto"/>
-        <w:rPr>
-          <w:lang w:val="ru-RU"/>
-        </w:rPr>
-      </w:pPr>
-      <w:r>
-        <w:rPr>
-          <w:rFonts w:ascii="Calibri" w:eastAsia="Calibri" w:hAnsi="Calibri" w:cs="Calibri"/>
-          <w:color w:val="20303A"/>
-          <w:sz w:val="22"/>
-          <w:szCs w:val="22"/>
-          <w:lang w:val="ru-RU"/>
-        </w:rPr>
-        <w:t>Цена бани — единственная строчка, которой не хватает в прайсе.</w:t>
       </w:r>
     </w:p>
     <w:p>
       <w:pPr>
         <w:pStyle w:val="1"/>
         <w:spacing w:before="240" w:after="200"/>
-        <w:rPr>
-          <w:lang w:val="ru-RU"/>
-        </w:rPr>
       </w:pPr>
       <w:r>
         <w:rPr>
@@ -3466,21 +2774,6 @@
           <w:lang w:val="ru-RU"/>
         </w:rPr>
         <w:t>Сколько это стоит</w:t>
-      </w:r>
-    </w:p>
-    <w:p>
-      <w:pPr>
-        <w:spacing w:after="140" w:line="300" w:lineRule="auto"/>
-      </w:pPr>
-      <w:r>
-        <w:rPr>
-          <w:rFonts w:ascii="Calibri" w:eastAsia="Calibri" w:hAnsi="Calibri" w:cs="Calibri"/>
-          <w:color w:val="20303A"/>
-          <w:sz w:val="22"/>
-          <w:szCs w:val="22"/>
-          <w:lang w:val="ru-RU"/>
-        </w:rPr>
-        <w:t>Сайт уже сделан — я не прошу денег за разработку вслепую. Обсуждаем итог, когда вы его увидите и потрогаете.</w:t>
       </w:r>
     </w:p>
     <w:tbl>
@@ -3504,12 +2797,6 @@
         <w:gridCol w:w="9026"/>
       </w:tblGrid>
       <w:tr>
-        <w:tblPrEx>
-          <w:tblCellMar>
-            <w:top w:w="0" w:type="dxa"/>
-            <w:bottom w:w="0" w:type="dxa"/>
-          </w:tblCellMar>
-        </w:tblPrEx>
         <w:tc>
           <w:tcPr>
             <w:tcW w:w="9026" w:type="dxa"/>
@@ -3669,14 +2956,6 @@
     </w:tbl>
     <w:p>
       <w:pPr>
-        <w:spacing w:after="240"/>
-        <w:rPr>
-          <w:lang w:val="ru-RU"/>
-        </w:rPr>
-      </w:pPr>
-    </w:p>
-    <w:p>
-      <w:pPr>
         <w:spacing w:after="140" w:line="300" w:lineRule="auto"/>
         <w:rPr>
           <w:lang w:val="ru-RU"/>
@@ -3708,6 +2987,9 @@
       <w:pPr>
         <w:pStyle w:val="2"/>
         <w:spacing w:before="260" w:after="120"/>
+        <w:rPr>
+          <w:lang w:val="ru-RU"/>
+        </w:rPr>
       </w:pPr>
       <w:r>
         <w:rPr>
@@ -3717,7 +2999,7 @@
           <w:color w:val="2F7A5E"/>
           <w:lang w:val="ru-RU"/>
         </w:rPr>
-        <w:t>Предложение простое</w:t>
+        <w:t>Предложение</w:t>
       </w:r>
     </w:p>
     <w:p>
@@ -3735,39 +3017,27 @@
           <w:szCs w:val="22"/>
           <w:lang w:val="ru-RU"/>
         </w:rPr>
-        <w:t>Я даю вам доступ на неделю. Заходите, меняйте, ломайте, показывайте кому хотите. Через неделю созвонимся и решите: запускаем или нет.</w:t>
-      </w:r>
-    </w:p>
-    <w:p>
-      <w:pPr>
-        <w:spacing w:after="140" w:line="300" w:lineRule="auto"/>
-        <w:rPr>
-          <w:lang w:val="ru-RU"/>
-        </w:rPr>
-      </w:pPr>
-      <w:r>
-        <w:rPr>
-          <w:rFonts w:ascii="Calibri" w:eastAsia="Calibri" w:hAnsi="Calibri" w:cs="Calibri"/>
-          <w:b/>
-          <w:bCs/>
-          <w:color w:val="20303A"/>
-          <w:sz w:val="22"/>
-          <w:szCs w:val="22"/>
-          <w:lang w:val="ru-RU"/>
-        </w:rPr>
-        <w:t>Если нет — вы ничего не тер</w:t>
-      </w:r>
-      <w:r>
-        <w:rPr>
-          <w:rFonts w:ascii="Calibri" w:eastAsia="Calibri" w:hAnsi="Calibri" w:cs="Calibri"/>
-          <w:b/>
-          <w:bCs/>
-          <w:color w:val="20303A"/>
-          <w:sz w:val="22"/>
-          <w:szCs w:val="22"/>
-          <w:lang w:val="ru-RU"/>
-        </w:rPr>
-        <w:t>яете</w:t>
+        <w:t xml:space="preserve">Заходите, меняйте, ломайте, показывайте кому хотите. Через неделю </w:t>
+      </w:r>
+      <w:r>
+        <w:rPr>
+          <w:rFonts w:ascii="Calibri" w:eastAsia="Calibri" w:hAnsi="Calibri" w:cs="Calibri"/>
+          <w:color w:val="20303A"/>
+          <w:sz w:val="22"/>
+          <w:szCs w:val="22"/>
+          <w:lang w:val="ru-RU"/>
+        </w:rPr>
+        <w:t>решите</w:t>
+      </w:r>
+      <w:r>
+        <w:rPr>
+          <w:rFonts w:ascii="Calibri" w:eastAsia="Calibri" w:hAnsi="Calibri" w:cs="Calibri"/>
+          <w:color w:val="20303A"/>
+          <w:sz w:val="22"/>
+          <w:szCs w:val="22"/>
+          <w:lang w:val="ru-RU"/>
+        </w:rPr>
+        <w:t>: запускаем или нет.</w:t>
       </w:r>
     </w:p>
     <w:p>
@@ -4429,6 +3699,7 @@
   <w:style w:type="character" w:default="1" w:styleId="a0">
     <w:name w:val="Default Paragraph Font"/>
     <w:uiPriority w:val="1"/>
+    <w:semiHidden/>
     <w:unhideWhenUsed/>
   </w:style>
   <w:style w:type="table" w:default="1" w:styleId="a1">

</xml_diff>